<commit_message>
MRP Proposal, Draft: bullet spacing tight, as the OPs
</commit_message>
<xml_diff>
--- a/week-11-launch-and-topic/MRP Draft.docx
+++ b/week-11-launch-and-topic/MRP Draft.docx
@@ -105,7 +105,7 @@
           <w:ilvl w:val="0"/>
           <w:numId w:val="1"/>
         </w:numPr>
-        <w:spacing w:after="200" w:line="276" w:lineRule="auto"/>
+        <w:spacing w:after="0" w:before="0"/>
       </w:pPr>
       <w:r>
         <w:rPr>
@@ -132,7 +132,7 @@
           <w:ilvl w:val="0"/>
           <w:numId w:val="1"/>
         </w:numPr>
-        <w:spacing w:after="200" w:line="276" w:lineRule="auto"/>
+        <w:spacing w:after="0" w:before="0"/>
       </w:pPr>
       <w:r>
         <w:rPr>
@@ -173,7 +173,7 @@
           <w:ilvl w:val="0"/>
           <w:numId w:val="1"/>
         </w:numPr>
-        <w:spacing w:after="200" w:line="276" w:lineRule="auto"/>
+        <w:spacing w:after="0" w:before="0"/>
       </w:pPr>
       <w:r>
         <w:rPr>
@@ -190,7 +190,7 @@
           <w:ilvl w:val="0"/>
           <w:numId w:val="1"/>
         </w:numPr>
-        <w:spacing w:after="200" w:line="276" w:lineRule="auto"/>
+        <w:spacing w:after="0" w:before="0"/>
       </w:pPr>
       <w:r>
         <w:rPr>

</xml_diff>

<commit_message>
MRP Draft: the eight required elements are listed in the handout itself
</commit_message>
<xml_diff>
--- a/week-11-launch-and-topic/MRP Draft.docx
+++ b/week-11-launch-and-topic/MRP Draft.docx
@@ -123,7 +123,143 @@
           <w:sz w:val="22"/>
           <w:szCs w:val="22"/>
         </w:rPr>
-        <w:t xml:space="preserve"> The list is in the Multimodal Research Project handout. Not every piece has to be finished, but each one should be started, and the whole should read in order.</w:t>
+        <w:t xml:space="preserve"> Not every piece has to be finished, but each one should be started, and the whole should read in order. The eight:</w:t>
+      </w:r>
+    </w:p>
+    <w:p>
+      <w:pPr>
+        <w:numPr>
+          <w:ilvl w:val="1"/>
+          <w:numId w:val="1"/>
+        </w:numPr>
+        <w:spacing w:after="0" w:before="0"/>
+      </w:pPr>
+      <w:r>
+        <w:rPr>
+          <w:rFonts w:ascii="Calibri" w:hAnsi="Calibri" w:eastAsia="Calibri" w:cs="Calibri"/>
+          <w:sz w:val="22"/>
+          <w:szCs w:val="22"/>
+        </w:rPr>
+        <w:t xml:space="preserve">Preface, introduction, or Dear Reader</w:t>
+      </w:r>
+    </w:p>
+    <w:p>
+      <w:pPr>
+        <w:numPr>
+          <w:ilvl w:val="1"/>
+          <w:numId w:val="1"/>
+        </w:numPr>
+        <w:spacing w:after="0" w:before="0"/>
+      </w:pPr>
+      <w:r>
+        <w:rPr>
+          <w:rFonts w:ascii="Calibri" w:hAnsi="Calibri" w:eastAsia="Calibri" w:cs="Calibri"/>
+          <w:sz w:val="22"/>
+          <w:szCs w:val="22"/>
+        </w:rPr>
+        <w:t xml:space="preserve">Brief informational essay, 250 to 350 words. Vivid, straight-ahead writing that boils your topic down to essentials.</w:t>
+      </w:r>
+    </w:p>
+    <w:p>
+      <w:pPr>
+        <w:numPr>
+          <w:ilvl w:val="1"/>
+          <w:numId w:val="1"/>
+        </w:numPr>
+        <w:spacing w:after="0" w:before="0"/>
+      </w:pPr>
+      <w:r>
+        <w:rPr>
+          <w:rFonts w:ascii="Calibri" w:hAnsi="Calibri" w:eastAsia="Calibri" w:cs="Calibri"/>
+          <w:sz w:val="22"/>
+          <w:szCs w:val="22"/>
+        </w:rPr>
+        <w:t xml:space="preserve">Poetry in contemporary free verse</w:t>
+      </w:r>
+    </w:p>
+    <w:p>
+      <w:pPr>
+        <w:numPr>
+          <w:ilvl w:val="1"/>
+          <w:numId w:val="1"/>
+        </w:numPr>
+        <w:spacing w:after="0" w:before="0"/>
+      </w:pPr>
+      <w:r>
+        <w:rPr>
+          <w:rFonts w:ascii="Calibri" w:hAnsi="Calibri" w:eastAsia="Calibri" w:cs="Calibri"/>
+          <w:sz w:val="22"/>
+          <w:szCs w:val="22"/>
+        </w:rPr>
+        <w:t xml:space="preserve">A visual element, or the arts</w:t>
+      </w:r>
+    </w:p>
+    <w:p>
+      <w:pPr>
+        <w:numPr>
+          <w:ilvl w:val="1"/>
+          <w:numId w:val="1"/>
+        </w:numPr>
+        <w:spacing w:after="0" w:before="0"/>
+      </w:pPr>
+      <w:r>
+        <w:rPr>
+          <w:rFonts w:ascii="Calibri" w:hAnsi="Calibri" w:eastAsia="Calibri" w:cs="Calibri"/>
+          <w:sz w:val="22"/>
+          <w:szCs w:val="22"/>
+        </w:rPr>
+        <w:t xml:space="preserve">Unifying elements: a repetend, repeated images, genres answered, a fragmented narrative</w:t>
+      </w:r>
+    </w:p>
+    <w:p>
+      <w:pPr>
+        <w:numPr>
+          <w:ilvl w:val="1"/>
+          <w:numId w:val="1"/>
+        </w:numPr>
+        <w:spacing w:after="0" w:before="0"/>
+      </w:pPr>
+      <w:r>
+        <w:rPr>
+          <w:rFonts w:ascii="Calibri" w:hAnsi="Calibri" w:eastAsia="Calibri" w:cs="Calibri"/>
+          <w:sz w:val="22"/>
+          <w:szCs w:val="22"/>
+        </w:rPr>
+        <w:t xml:space="preserve">Note page(s)</w:t>
+      </w:r>
+    </w:p>
+    <w:p>
+      <w:pPr>
+        <w:numPr>
+          <w:ilvl w:val="1"/>
+          <w:numId w:val="1"/>
+        </w:numPr>
+        <w:spacing w:after="0" w:before="0"/>
+      </w:pPr>
+      <w:r>
+        <w:rPr>
+          <w:rFonts w:ascii="Calibri" w:hAnsi="Calibri" w:eastAsia="Calibri" w:cs="Calibri"/>
+          <w:sz w:val="22"/>
+          <w:szCs w:val="22"/>
+        </w:rPr>
+        <w:t xml:space="preserve">Works Cited: at least one book, one peer-reviewed journal article, and one primary source you gathered yourself</w:t>
+      </w:r>
+    </w:p>
+    <w:p>
+      <w:pPr>
+        <w:numPr>
+          <w:ilvl w:val="1"/>
+          <w:numId w:val="1"/>
+        </w:numPr>
+        <w:spacing w:after="0" w:before="0"/>
+      </w:pPr>
+      <w:r>
+        <w:rPr>
+          <w:rFonts w:ascii="Calibri" w:hAnsi="Calibri" w:eastAsia="Calibri" w:cs="Calibri"/>
+          <w:sz w:val="22"/>
+          <w:szCs w:val="22"/>
+        </w:rPr>
+        <w:t xml:space="preserve">Finale</w:t>
       </w:r>
     </w:p>
     <w:p>

</xml_diff>